<commit_message>
docs(pousada): adiciona nomes da equipe na capa
</commit_message>
<xml_diff>
--- a/How Much Is Left From Each Booking.docx
+++ b/How Much Is Left From Each Booking.docx
@@ -70,7 +70,7 @@
                 <w:sz w:val="18"/>
                 <w:szCs w:val="18"/>
               </w:rPr>
-              <w:t xml:space="preserve">Student</w:t>
+              <w:t xml:space="preserve">Team members</w:t>
             </w:r>
           </w:p>
         </w:tc>
@@ -95,7 +95,7 @@
                 <w:sz w:val="18"/>
                 <w:szCs w:val="18"/>
               </w:rPr>
-              <w:t xml:space="preserve">[FILL IN: your full name]</w:t>
+              <w:t xml:space="preserve">Zuzanna Kuczynska</w:t>
             </w:r>
           </w:p>
         </w:tc>
@@ -122,7 +122,7 @@
                 <w:sz w:val="18"/>
                 <w:szCs w:val="18"/>
               </w:rPr>
-              <w:t xml:space="preserve">Team</w:t>
+              <w:t xml:space="preserve"/>
             </w:r>
           </w:p>
         </w:tc>
@@ -147,7 +147,111 @@
                 <w:sz w:val="18"/>
                 <w:szCs w:val="18"/>
               </w:rPr>
-              <w:t xml:space="preserve">[FILL IN: team members' names]</w:t>
+              <w:t xml:space="preserve">Maksymilian Dominik Wojnowski</w:t>
+            </w:r>
+          </w:p>
+        </w:tc>
+      </w:tr>
+      <w:tr>
+        <w:tc>
+          <w:tcPr>
+            <w:tcW w:type="dxa" w:w="2300"/>
+            <w:tcMar>
+              <w:top w:type="dxa" w:w="50"/>
+              <w:left w:type="dxa" w:w="80"/>
+              <w:bottom w:type="dxa" w:w="50"/>
+              <w:right w:type="dxa" w:w="80"/>
+            </w:tcMar>
+          </w:tcPr>
+          <w:p>
+            <w:pPr>
+              <w:spacing w:after="0"/>
+            </w:pPr>
+            <w:r>
+              <w:rPr>
+                <w:b/>
+                <w:bCs/>
+                <w:sz w:val="18"/>
+                <w:szCs w:val="18"/>
+              </w:rPr>
+              <w:t xml:space="preserve"/>
+            </w:r>
+          </w:p>
+        </w:tc>
+        <w:tc>
+          <w:tcPr>
+            <w:tcW w:type="dxa" w:w="6700"/>
+            <w:tcMar>
+              <w:top w:type="dxa" w:w="50"/>
+              <w:left w:type="dxa" w:w="80"/>
+              <w:bottom w:type="dxa" w:w="50"/>
+              <w:right w:type="dxa" w:w="80"/>
+            </w:tcMar>
+          </w:tcPr>
+          <w:p>
+            <w:pPr>
+              <w:spacing w:after="0"/>
+            </w:pPr>
+            <w:r>
+              <w:rPr>
+                <w:b w:val="false"/>
+                <w:bCs w:val="false"/>
+                <w:sz w:val="18"/>
+                <w:szCs w:val="18"/>
+              </w:rPr>
+              <w:t xml:space="preserve">Edmund Soares de Sousa</w:t>
+            </w:r>
+          </w:p>
+        </w:tc>
+      </w:tr>
+      <w:tr>
+        <w:tc>
+          <w:tcPr>
+            <w:tcW w:type="dxa" w:w="2300"/>
+            <w:tcMar>
+              <w:top w:type="dxa" w:w="50"/>
+              <w:left w:type="dxa" w:w="80"/>
+              <w:bottom w:type="dxa" w:w="50"/>
+              <w:right w:type="dxa" w:w="80"/>
+            </w:tcMar>
+          </w:tcPr>
+          <w:p>
+            <w:pPr>
+              <w:spacing w:after="0"/>
+            </w:pPr>
+            <w:r>
+              <w:rPr>
+                <w:b/>
+                <w:bCs/>
+                <w:sz w:val="18"/>
+                <w:szCs w:val="18"/>
+              </w:rPr>
+              <w:t xml:space="preserve"/>
+            </w:r>
+          </w:p>
+        </w:tc>
+        <w:tc>
+          <w:tcPr>
+            <w:tcW w:type="dxa" w:w="6700"/>
+            <w:tcMar>
+              <w:top w:type="dxa" w:w="50"/>
+              <w:left w:type="dxa" w:w="80"/>
+              <w:bottom w:type="dxa" w:w="50"/>
+              <w:right w:type="dxa" w:w="80"/>
+            </w:tcMar>
+          </w:tcPr>
+          <w:p>
+            <w:pPr>
+              <w:spacing w:after="0"/>
+            </w:pPr>
+            <w:r>
+              <w:rPr>
+                <w:b w:val="false"/>
+                <w:bCs w:val="false"/>
+                <w:sz w:val="18"/>
+                <w:szCs w:val="18"/>
+              </w:rPr>
+              <w:t xml:space="preserve">João Victor Carvalho de Freitas</w:t>
             </w:r>
           </w:p>
         </w:tc>
@@ -12294,7 +12398,7 @@
         <w:spacing w:after="120"/>
       </w:pPr>
       <w:r>
-        <w:t xml:space="preserve">In accordance with PUCPR Resolution No. 274/2024 CONSUN, the use of a Generative Artificial Intelligence tool in producing this work is declared. The author reviewed and edited the content as needed and takes full responsibility for the content presented. The interactions are documented in sections 1.4 and 2.4, including the prompts used, the suggestions accepted, the suggestions rejected and the reasoning behind each decision.</w:t>
+        <w:t xml:space="preserve">In accordance with PUCPR Resolution No. 274/2024 CONSUN, the use of a Generative Artificial Intelligence tool in producing this work is declared. The authors reviewed and edited the content as needed and take full responsibility for the content presented. The interactions are documented in sections 1.4 and 2.4, including the prompts used, the suggestions accepted, the suggestions rejected and the reasoning behind each decision.</w:t>
       </w:r>
     </w:p>
     <w:sectPr>

</xml_diff>

<commit_message>
docs(pousada): explicita unidades da saida no modelo E/P/S
</commit_message>
<xml_diff>
--- a/How Much Is Left From Each Booking.docx
+++ b/How Much Is Left From Each Booking.docx
@@ -3032,6 +3032,22 @@
         </w:rPr>
         <w:lastRenderedPageBreak/>
         <w:t>What is left: total net revenue, per night, per guest and the percentage kept of the amount paid.</w:t>
+      </w:r>
+    </w:p>
+    <w:p>
+      <w:pPr>
+        <w:spacing w:after="120"/>
+        <w:rPr>
+          <w:rFonts w:asciiTheme="minorHAnsi" w:hAnsiTheme="minorHAnsi" w:cstheme="minorHAnsi"/>
+          <w:lang w:val="en-US"/>
+        </w:rPr>
+      </w:pPr>
+      <w:r>
+        <w:rPr>
+          <w:rFonts w:asciiTheme="minorHAnsi" w:hAnsiTheme="minorHAnsi" w:cstheme="minorHAnsi"/>
+          <w:lang w:val="en-US"/>
+        </w:rPr>
+        <w:t xml:space="preserve">Units and formats: all amounts are in R$ with two decimals; the channel commission and the share kept are percentages with one decimal, and the deposit rate is a whole percentage.</w:t>
       </w:r>
     </w:p>
     <w:p>

</xml_diff>